<commit_message>
feat: implement 5-stages pipline and test using test program
</commit_message>
<xml_diff>
--- a/doc/PLAN/初期阶段报告.docx
+++ b/doc/PLAN/初期阶段报告.docx
@@ -969,9 +969,9 @@
         </w:tblCellMar>
       </w:tblPr>
       <w:tblGrid>
-        <w:gridCol w:w="2860"/>
-        <w:gridCol w:w="2817"/>
-        <w:gridCol w:w="2817"/>
+        <w:gridCol w:w="2906"/>
+        <w:gridCol w:w="2907"/>
+        <w:gridCol w:w="2907"/>
       </w:tblGrid>
       <w:tr>
         <w:tblPrEx>
@@ -2043,8 +2043,8 @@
         </w:tblCellMar>
       </w:tblPr>
       <w:tblGrid>
-        <w:gridCol w:w="827"/>
-        <w:gridCol w:w="7667"/>
+        <w:gridCol w:w="835"/>
+        <w:gridCol w:w="7885"/>
       </w:tblGrid>
       <w:tr>
         <w:tblPrEx>
@@ -2437,9 +2437,9 @@
         </w:tblCellMar>
       </w:tblPr>
       <w:tblGrid>
-        <w:gridCol w:w="2936"/>
-        <w:gridCol w:w="2369"/>
-        <w:gridCol w:w="3189"/>
+        <w:gridCol w:w="3003"/>
+        <w:gridCol w:w="2461"/>
+        <w:gridCol w:w="3256"/>
       </w:tblGrid>
       <w:tr>
         <w:tblPrEx>
@@ -3049,10 +3049,10 @@
         </w:tblCellMar>
       </w:tblPr>
       <w:tblGrid>
-        <w:gridCol w:w="850"/>
-        <w:gridCol w:w="1943"/>
-        <w:gridCol w:w="4446"/>
-        <w:gridCol w:w="1255"/>
+        <w:gridCol w:w="856"/>
+        <w:gridCol w:w="1967"/>
+        <w:gridCol w:w="4522"/>
+        <w:gridCol w:w="1276"/>
       </w:tblGrid>
       <w:tr>
         <w:tblPrEx>
@@ -3585,6 +3585,14 @@
       </w:tr>
       <w:tr>
         <w:tblPrEx>
+          <w:tblBorders>
+            <w:top w:val="single" w:color="auto" w:sz="4" w:space="0"/>
+            <w:left w:val="single" w:color="auto" w:sz="4" w:space="0"/>
+            <w:bottom w:val="single" w:color="auto" w:sz="4" w:space="0"/>
+            <w:right w:val="single" w:color="auto" w:sz="4" w:space="0"/>
+            <w:insideH w:val="single" w:color="auto" w:sz="4" w:space="0"/>
+            <w:insideV w:val="single" w:color="auto" w:sz="4" w:space="0"/>
+          </w:tblBorders>
           <w:tblCellMar>
             <w:top w:w="0" w:type="dxa"/>
             <w:left w:w="108" w:type="dxa"/>
@@ -3901,6 +3909,14 @@
       </w:tr>
       <w:tr>
         <w:tblPrEx>
+          <w:tblBorders>
+            <w:top w:val="single" w:color="auto" w:sz="4" w:space="0"/>
+            <w:left w:val="single" w:color="auto" w:sz="4" w:space="0"/>
+            <w:bottom w:val="single" w:color="auto" w:sz="4" w:space="0"/>
+            <w:right w:val="single" w:color="auto" w:sz="4" w:space="0"/>
+            <w:insideH w:val="single" w:color="auto" w:sz="4" w:space="0"/>
+            <w:insideV w:val="single" w:color="auto" w:sz="4" w:space="0"/>
+          </w:tblBorders>
           <w:tblCellMar>
             <w:top w:w="0" w:type="dxa"/>
             <w:left w:w="108" w:type="dxa"/>
@@ -4699,12 +4715,6 @@
             <w:insideH w:val="single" w:color="auto" w:sz="4" w:space="0"/>
             <w:insideV w:val="single" w:color="auto" w:sz="4" w:space="0"/>
           </w:tblBorders>
-          <w:tblCellMar>
-            <w:top w:w="0" w:type="dxa"/>
-            <w:left w:w="108" w:type="dxa"/>
-            <w:bottom w:w="0" w:type="dxa"/>
-            <w:right w:w="108" w:type="dxa"/>
-          </w:tblCellMar>
         </w:tblPrEx>
         <w:tc>
           <w:tcPr>
@@ -5890,49 +5900,31 @@
     <w:p>
       <w:pPr>
         <w:pStyle w:val="20"/>
+        <w:ind w:left="0" w:leftChars="0" w:firstLine="0" w:firstLineChars="0"/>
+        <w:jc w:val="center"/>
+        <w:rPr>
+          <w:rFonts w:hint="eastAsia" w:eastAsia="等线"/>
+          <w:lang w:eastAsia="zh-CN"/>
+        </w:rPr>
       </w:pPr>
       <w:r>
-        <w:drawing>
-          <wp:inline distT="0" distB="0" distL="114300" distR="114300">
-            <wp:extent cx="4343400" cy="5129530"/>
-            <wp:effectExtent l="0" t="0" r="0" b="0"/>
-            <wp:docPr id="21" name="Picture" title="fig:"/>
-            <wp:cNvGraphicFramePr>
-              <a:graphicFrameLocks xmlns:a="http://schemas.openxmlformats.org/drawingml/2006/main" noChangeAspect="1"/>
-            </wp:cNvGraphicFramePr>
-            <a:graphic xmlns:a="http://schemas.openxmlformats.org/drawingml/2006/main">
-              <a:graphicData uri="http://schemas.openxmlformats.org/drawingml/2006/picture">
-                <pic:pic xmlns:pic="http://schemas.openxmlformats.org/drawingml/2006/picture">
-                  <pic:nvPicPr>
-                    <pic:cNvPr id="21" name="Picture" title="fig:"/>
-                    <pic:cNvPicPr>
-                      <a:picLocks noChangeAspect="1" noChangeArrowheads="1"/>
-                    </pic:cNvPicPr>
-                  </pic:nvPicPr>
-                  <pic:blipFill>
-                    <a:blip r:embed="rId5"/>
-                    <a:stretch>
-                      <a:fillRect/>
-                    </a:stretch>
-                  </pic:blipFill>
-                  <pic:spPr>
-                    <a:xfrm>
-                      <a:off x="0" y="0"/>
-                      <a:ext cx="4343400" cy="5129907"/>
-                    </a:xfrm>
-                    <a:prstGeom prst="rect">
-                      <a:avLst/>
-                    </a:prstGeom>
-                    <a:noFill/>
-                    <a:ln w="9525">
-                      <a:noFill/>
-                    </a:ln>
-                  </pic:spPr>
-                </pic:pic>
-              </a:graphicData>
-            </a:graphic>
-          </wp:inline>
-        </w:drawing>
+        <w:rPr>
+          <w:rFonts w:hint="eastAsia" w:eastAsia="等线"/>
+          <w:lang w:eastAsia="zh-CN"/>
+        </w:rPr>
+        <w:object>
+          <v:shape id="_x0000_i1027" o:spt="75" type="#_x0000_t75" style="height:421pt;width:272pt;" o:ole="t" filled="f" o:preferrelative="t" stroked="f" coordsize="21600,21600">
+            <v:fill on="f" focussize="0,0"/>
+            <v:stroke on="f"/>
+            <v:imagedata r:id="rId6" o:title=""/>
+            <o:lock v:ext="edit" aspectratio="t"/>
+            <w10:wrap type="none"/>
+            <w10:anchorlock/>
+          </v:shape>
+          <o:OLEObject Type="Embed" ProgID="Visio.Drawing.15" ShapeID="_x0000_i1027" DrawAspect="Content" ObjectID="_1468075725" r:id="rId5">
+            <o:LockedField>false</o:LockedField>
+          </o:OLEObject>
+        </w:object>
       </w:r>
     </w:p>
     <w:bookmarkEnd w:id="13"/>
@@ -6210,7 +6202,38 @@
     </w:p>
     <w:p>
       <w:pPr>
+        <w:pStyle w:val="3"/>
+        <w:ind w:left="0" w:leftChars="0" w:firstLine="0" w:firstLineChars="0"/>
+        <w:rPr>
+          <w:lang w:val="en-US" w:eastAsia="zh-CN"/>
+        </w:rPr>
+      </w:pPr>
+      <w:bookmarkStart w:id="49" w:name="_GoBack"/>
+      <w:r>
+        <w:rPr>
+          <w:lang w:val="en-US" w:eastAsia="zh-CN"/>
+        </w:rPr>
+        <w:object>
+          <v:shape id="_x0000_i1028" o:spt="75" type="#_x0000_t75" style="height:270.4pt;width:451.9pt;" o:ole="t" filled="f" o:preferrelative="t" stroked="f" coordsize="21600,21600">
+            <v:path/>
+            <v:fill on="f" focussize="0,0"/>
+            <v:stroke on="f"/>
+            <v:imagedata r:id="rId8" o:title=""/>
+            <o:lock v:ext="edit" aspectratio="t"/>
+            <w10:wrap type="none"/>
+            <w10:anchorlock/>
+          </v:shape>
+          <o:OLEObject Type="Embed" ProgID="Visio.Drawing.15" ShapeID="_x0000_i1028" DrawAspect="Content" ObjectID="_1468075726" r:id="rId7">
+            <o:LockedField>false</o:LockedField>
+          </o:OLEObject>
+        </w:object>
+      </w:r>
+      <w:bookmarkEnd w:id="49"/>
+    </w:p>
+    <w:p>
+      <w:pPr>
         <w:pStyle w:val="4"/>
+        <w:ind w:left="0" w:leftChars="0" w:firstLine="0" w:firstLineChars="0"/>
         <w:rPr>
           <w:rFonts w:ascii="等线" w:hAnsi="等线" w:eastAsia="等线" w:cs="等线"/>
           <w:b/>
@@ -6481,15 +6504,7 @@
         <w:rPr>
           <w:rStyle w:val="21"/>
         </w:rPr>
-        <w:t xml:space="preserve"> | opcode(4) | rs</w:t>
-      </w:r>
-      <w:bookmarkStart w:id="49" w:name="_GoBack"/>
-      <w:bookmarkEnd w:id="49"/>
-      <w:r>
-        <w:rPr>
-          <w:rStyle w:val="21"/>
-        </w:rPr>
-        <w:t>1(3) | rs2(3) | rd(3) | funct(3) |</w:t>
+        <w:t xml:space="preserve"> | opcode(4) | rs1(3) | rs2(3) | rd(3) | funct(3) |</w:t>
       </w:r>
       <w:r>
         <w:br w:type="textWrapping"/>
@@ -6618,7 +6633,7 @@
       <w:tblGrid>
         <w:gridCol w:w="1289"/>
         <w:gridCol w:w="3309"/>
-        <w:gridCol w:w="3896"/>
+        <w:gridCol w:w="4122"/>
       </w:tblGrid>
       <w:tr>
         <w:tblPrEx>
@@ -6936,10 +6951,10 @@
         </w:tblCellMar>
       </w:tblPr>
       <w:tblGrid>
-        <w:gridCol w:w="2013"/>
-        <w:gridCol w:w="829"/>
-        <w:gridCol w:w="3258"/>
-        <w:gridCol w:w="2394"/>
+        <w:gridCol w:w="2049"/>
+        <w:gridCol w:w="838"/>
+        <w:gridCol w:w="3362"/>
+        <w:gridCol w:w="2471"/>
       </w:tblGrid>
       <w:tr>
         <w:tblPrEx>
@@ -7681,12 +7696,6 @@
             <w:insideH w:val="single" w:color="auto" w:sz="4" w:space="0"/>
             <w:insideV w:val="single" w:color="auto" w:sz="4" w:space="0"/>
           </w:tblBorders>
-          <w:tblCellMar>
-            <w:top w:w="0" w:type="dxa"/>
-            <w:left w:w="108" w:type="dxa"/>
-            <w:bottom w:w="0" w:type="dxa"/>
-            <w:right w:w="108" w:type="dxa"/>
-          </w:tblCellMar>
         </w:tblPrEx>
         <w:tc>
           <w:tcPr>
@@ -7828,11 +7837,11 @@
         </w:tblCellMar>
       </w:tblPr>
       <w:tblGrid>
-        <w:gridCol w:w="1348"/>
-        <w:gridCol w:w="976"/>
-        <w:gridCol w:w="724"/>
-        <w:gridCol w:w="2396"/>
-        <w:gridCol w:w="3050"/>
+        <w:gridCol w:w="1362"/>
+        <w:gridCol w:w="980"/>
+        <w:gridCol w:w="731"/>
+        <w:gridCol w:w="2482"/>
+        <w:gridCol w:w="3165"/>
       </w:tblGrid>
       <w:tr>
         <w:tblPrEx>
@@ -12647,6 +12656,7 @@
     <w:p>
       <w:pPr>
         <w:pStyle w:val="4"/>
+        <w:ind w:left="0" w:leftChars="0" w:firstLine="0" w:firstLineChars="0"/>
         <w:rPr>
           <w:rFonts w:hint="eastAsia" w:ascii="等线" w:hAnsi="等线" w:eastAsia="等线" w:cs="等线"/>
           <w:b/>
@@ -12711,9 +12721,9 @@
       </w:tblPr>
       <w:tblGrid>
         <w:gridCol w:w="906"/>
-        <w:gridCol w:w="1700"/>
-        <w:gridCol w:w="2501"/>
-        <w:gridCol w:w="3387"/>
+        <w:gridCol w:w="1764"/>
+        <w:gridCol w:w="2556"/>
+        <w:gridCol w:w="3494"/>
       </w:tblGrid>
       <w:tr>
         <w:tblPrEx>
@@ -14567,15 +14577,15 @@
         </w:tblCellMar>
       </w:tblPr>
       <w:tblGrid>
-        <w:gridCol w:w="1027"/>
-        <w:gridCol w:w="981"/>
-        <w:gridCol w:w="1044"/>
-        <w:gridCol w:w="1066"/>
-        <w:gridCol w:w="1133"/>
-        <w:gridCol w:w="844"/>
-        <w:gridCol w:w="847"/>
-        <w:gridCol w:w="825"/>
-        <w:gridCol w:w="727"/>
+        <w:gridCol w:w="1056"/>
+        <w:gridCol w:w="1007"/>
+        <w:gridCol w:w="1072"/>
+        <w:gridCol w:w="1095"/>
+        <w:gridCol w:w="1165"/>
+        <w:gridCol w:w="865"/>
+        <w:gridCol w:w="869"/>
+        <w:gridCol w:w="846"/>
+        <w:gridCol w:w="745"/>
       </w:tblGrid>
       <w:tr>
         <w:tblPrEx>
@@ -16273,12 +16283,6 @@
             <w:insideH w:val="single" w:color="auto" w:sz="4" w:space="0"/>
             <w:insideV w:val="single" w:color="auto" w:sz="4" w:space="0"/>
           </w:tblBorders>
-          <w:tblCellMar>
-            <w:top w:w="0" w:type="dxa"/>
-            <w:left w:w="108" w:type="dxa"/>
-            <w:bottom w:w="0" w:type="dxa"/>
-            <w:right w:w="108" w:type="dxa"/>
-          </w:tblCellMar>
         </w:tblPrEx>
         <w:trPr>
           <w:tblHeader/>
@@ -16531,6 +16535,7 @@
     <w:p>
       <w:pPr>
         <w:pStyle w:val="4"/>
+        <w:ind w:left="0" w:leftChars="0" w:firstLine="0" w:firstLineChars="0"/>
         <w:rPr>
           <w:rFonts w:ascii="等线" w:hAnsi="等线" w:eastAsia="等线" w:cs="等线"/>
           <w:b/>
@@ -16802,8 +16807,8 @@
         </w:tblCellMar>
       </w:tblPr>
       <w:tblGrid>
-        <w:gridCol w:w="3417"/>
-        <w:gridCol w:w="5077"/>
+        <w:gridCol w:w="3472"/>
+        <w:gridCol w:w="5248"/>
       </w:tblGrid>
       <w:tr>
         <w:tblPrEx>
@@ -16995,12 +17000,6 @@
             <w:insideH w:val="single" w:color="auto" w:sz="4" w:space="0"/>
             <w:insideV w:val="single" w:color="auto" w:sz="4" w:space="0"/>
           </w:tblBorders>
-          <w:tblCellMar>
-            <w:top w:w="0" w:type="dxa"/>
-            <w:left w:w="108" w:type="dxa"/>
-            <w:bottom w:w="0" w:type="dxa"/>
-            <w:right w:w="108" w:type="dxa"/>
-          </w:tblCellMar>
         </w:tblPrEx>
         <w:tc>
           <w:tcPr>
@@ -17151,37 +17150,6 @@
         <w:gridCol w:w="6668"/>
       </w:tblGrid>
       <w:tr>
-        <w:trPr>
-          <w:tblHeader/>
-        </w:trPr>
-        <w:tc>
-          <w:p>
-            <w:pPr>
-              <w:pStyle w:val="24"/>
-            </w:pPr>
-            <w:r>
-              <w:rPr>
-                <w:rFonts w:hint="eastAsia"/>
-              </w:rPr>
-              <w:t>输出</w:t>
-            </w:r>
-          </w:p>
-        </w:tc>
-        <w:tc>
-          <w:p>
-            <w:pPr>
-              <w:pStyle w:val="24"/>
-            </w:pPr>
-            <w:r>
-              <w:rPr>
-                <w:rFonts w:hint="eastAsia"/>
-              </w:rPr>
-              <w:t>说明</w:t>
-            </w:r>
-          </w:p>
-        </w:tc>
-      </w:tr>
-      <w:tr>
         <w:tblPrEx>
           <w:tblCellMar>
             <w:top w:w="0" w:type="dxa"/>
@@ -17190,6 +17158,37 @@
             <w:right w:w="108" w:type="dxa"/>
           </w:tblCellMar>
         </w:tblPrEx>
+        <w:trPr>
+          <w:tblHeader/>
+        </w:trPr>
+        <w:tc>
+          <w:p>
+            <w:pPr>
+              <w:pStyle w:val="24"/>
+            </w:pPr>
+            <w:r>
+              <w:rPr>
+                <w:rFonts w:hint="eastAsia"/>
+              </w:rPr>
+              <w:t>输出</w:t>
+            </w:r>
+          </w:p>
+        </w:tc>
+        <w:tc>
+          <w:p>
+            <w:pPr>
+              <w:pStyle w:val="24"/>
+            </w:pPr>
+            <w:r>
+              <w:rPr>
+                <w:rFonts w:hint="eastAsia"/>
+              </w:rPr>
+              <w:t>说明</w:t>
+            </w:r>
+          </w:p>
+        </w:tc>
+      </w:tr>
+      <w:tr>
         <w:tc>
           <w:p>
             <w:pPr>
@@ -17421,8 +17420,8 @@
         </w:tblCellMar>
       </w:tblPr>
       <w:tblGrid>
-        <w:gridCol w:w="5886"/>
-        <w:gridCol w:w="2608"/>
+        <w:gridCol w:w="6068"/>
+        <w:gridCol w:w="2652"/>
       </w:tblGrid>
       <w:tr>
         <w:tblPrEx>
@@ -18009,8 +18008,8 @@
         </w:tblCellMar>
       </w:tblPr>
       <w:tblGrid>
-        <w:gridCol w:w="1178"/>
-        <w:gridCol w:w="7316"/>
+        <w:gridCol w:w="1199"/>
+        <w:gridCol w:w="7521"/>
       </w:tblGrid>
       <w:tr>
         <w:tblPrEx>
@@ -18828,10 +18827,10 @@
         </w:tblCellMar>
       </w:tblPr>
       <w:tblGrid>
-        <w:gridCol w:w="1945"/>
-        <w:gridCol w:w="2479"/>
-        <w:gridCol w:w="2853"/>
-        <w:gridCol w:w="1217"/>
+        <w:gridCol w:w="1954"/>
+        <w:gridCol w:w="2544"/>
+        <w:gridCol w:w="2975"/>
+        <w:gridCol w:w="1247"/>
       </w:tblGrid>
       <w:tr>
         <w:tblPrEx>
@@ -20186,12 +20185,6 @@
             <w:insideH w:val="single" w:color="auto" w:sz="4" w:space="0"/>
             <w:insideV w:val="single" w:color="auto" w:sz="4" w:space="0"/>
           </w:tblBorders>
-          <w:tblCellMar>
-            <w:top w:w="0" w:type="dxa"/>
-            <w:left w:w="108" w:type="dxa"/>
-            <w:bottom w:w="0" w:type="dxa"/>
-            <w:right w:w="108" w:type="dxa"/>
-          </w:tblCellMar>
         </w:tblPrEx>
         <w:tc>
           <w:tcPr>
@@ -22515,12 +22508,6 @@
             <w:insideH w:val="single" w:color="auto" w:sz="4" w:space="0"/>
             <w:insideV w:val="single" w:color="auto" w:sz="4" w:space="0"/>
           </w:tblBorders>
-          <w:tblCellMar>
-            <w:top w:w="0" w:type="dxa"/>
-            <w:left w:w="108" w:type="dxa"/>
-            <w:bottom w:w="0" w:type="dxa"/>
-            <w:right w:w="108" w:type="dxa"/>
-          </w:tblCellMar>
         </w:tblPrEx>
         <w:tc>
           <w:tcPr>
@@ -24296,9 +24283,9 @@
         </w:tblCellMar>
       </w:tblPr>
       <w:tblGrid>
-        <w:gridCol w:w="785"/>
-        <w:gridCol w:w="5123"/>
-        <w:gridCol w:w="2586"/>
+        <w:gridCol w:w="791"/>
+        <w:gridCol w:w="5281"/>
+        <w:gridCol w:w="2648"/>
       </w:tblGrid>
       <w:tr>
         <w:tblPrEx>

</xml_diff>